<commit_message>
bugfix finite difference slope converger
</commit_message>
<xml_diff>
--- a/DDM GD Find Alpha Rebuild/Loss Function Derivative.docx
+++ b/DDM GD Find Alpha Rebuild/Loss Function Derivative.docx
@@ -6839,19 +6839,11 @@
         </w:rPr>
         <w:t xml:space="preserve"> a</w:t>
       </w:r>
-      <w:proofErr w:type="spellStart"/>
       <w:r>
         <w:rPr>
           <w:rFonts w:eastAsiaTheme="minorEastAsia"/>
         </w:rPr>
-        <w:t>nd</w:t>
-      </w:r>
-      <w:proofErr w:type="spellEnd"/>
-      <w:r>
-        <w:rPr>
-          <w:rFonts w:eastAsiaTheme="minorEastAsia"/>
-        </w:rPr>
-        <w:t xml:space="preserve"> the variability itself</w:t>
+        <w:t>nd the variability itself</w:t>
       </w:r>
       <w:r>
         <w:rPr>
@@ -9134,13 +9126,7 @@
             <w:rPr>
               <w:rFonts w:ascii="Cambria Math" w:eastAsia="Cambria Math" w:hAnsi="Cambria Math"/>
             </w:rPr>
-            <m:t>=</m:t>
-          </m:r>
-          <m:r>
-            <w:rPr>
-              <w:rFonts w:ascii="Cambria Math" w:eastAsia="Cambria Math" w:hAnsi="Cambria Math"/>
-            </w:rPr>
-            <m:t>2</m:t>
+            <m:t>=2</m:t>
           </m:r>
           <m:d>
             <m:dPr>
@@ -9759,13 +9745,7 @@
             <w:rPr>
               <w:rFonts w:ascii="Cambria Math" w:eastAsia="Cambria Math" w:hAnsi="Cambria Math"/>
             </w:rPr>
-            <m:t>=</m:t>
-          </m:r>
-          <m:r>
-            <w:rPr>
-              <w:rFonts w:ascii="Cambria Math" w:eastAsia="Cambria Math" w:hAnsi="Cambria Math"/>
-            </w:rPr>
-            <m:t>2</m:t>
+            <m:t>=2</m:t>
           </m:r>
           <m:d>
             <m:dPr>
@@ -10011,13 +9991,7 @@
             <w:rPr>
               <w:rFonts w:ascii="Cambria Math" w:eastAsia="Cambria Math" w:hAnsi="Cambria Math"/>
             </w:rPr>
-            <m:t>=</m:t>
-          </m:r>
-          <m:r>
-            <w:rPr>
-              <w:rFonts w:ascii="Cambria Math" w:eastAsia="Cambria Math" w:hAnsi="Cambria Math"/>
-            </w:rPr>
-            <m:t>2</m:t>
+            <m:t>=2</m:t>
           </m:r>
           <m:d>
             <m:dPr>
@@ -10563,13 +10537,7 @@
             <w:rPr>
               <w:rFonts w:ascii="Cambria Math" w:eastAsia="Cambria Math" w:hAnsi="Cambria Math"/>
             </w:rPr>
-            <m:t>=</m:t>
-          </m:r>
-          <m:r>
-            <w:rPr>
-              <w:rFonts w:ascii="Cambria Math" w:eastAsia="Cambria Math" w:hAnsi="Cambria Math"/>
-            </w:rPr>
-            <m:t>2</m:t>
+            <m:t>=2</m:t>
           </m:r>
           <m:f>
             <m:fPr>
@@ -12871,13 +12839,7 @@
             <w:rPr>
               <w:rFonts w:ascii="Cambria Math" w:eastAsiaTheme="minorEastAsia" w:hAnsi="Cambria Math"/>
             </w:rPr>
-            <m:t>=</m:t>
-          </m:r>
-          <m:r>
-            <w:rPr>
-              <w:rFonts w:ascii="Cambria Math" w:eastAsiaTheme="minorEastAsia" w:hAnsi="Cambria Math"/>
-            </w:rPr>
-            <m:t>m</m:t>
+            <m:t>=m</m:t>
           </m:r>
           <m:d>
             <m:dPr>
@@ -13121,6 +13083,75 @@
           </m:f>
         </m:oMath>
       </m:oMathPara>
+    </w:p>
+    <w:p>
+      <w:pPr>
+        <w:rPr>
+          <w:rFonts w:eastAsiaTheme="minorEastAsia"/>
+        </w:rPr>
+      </w:pPr>
+      <w:r>
+        <w:rPr>
+          <w:rFonts w:eastAsiaTheme="minorEastAsia"/>
+          <w:noProof/>
+        </w:rPr>
+        <w:lastRenderedPageBreak/>
+        <w:drawing>
+          <wp:inline distT="0" distB="0" distL="0" distR="0" wp14:anchorId="21EC8699" wp14:editId="5FB4AC63">
+            <wp:extent cx="5934075" cy="4200525"/>
+            <wp:effectExtent l="0" t="0" r="9525" b="9525"/>
+            <wp:docPr id="1075205414" name="Picture 1"/>
+            <wp:cNvGraphicFramePr>
+              <a:graphicFrameLocks xmlns:a="http://schemas.openxmlformats.org/drawingml/2006/main" noChangeAspect="1"/>
+            </wp:cNvGraphicFramePr>
+            <a:graphic xmlns:a="http://schemas.openxmlformats.org/drawingml/2006/main">
+              <a:graphicData uri="http://schemas.openxmlformats.org/drawingml/2006/picture">
+                <pic:pic xmlns:pic="http://schemas.openxmlformats.org/drawingml/2006/picture">
+                  <pic:nvPicPr>
+                    <pic:cNvPr id="0" name="Picture 1"/>
+                    <pic:cNvPicPr>
+                      <a:picLocks noChangeAspect="1" noChangeArrowheads="1"/>
+                    </pic:cNvPicPr>
+                  </pic:nvPicPr>
+                  <pic:blipFill>
+                    <a:blip r:embed="rId6">
+                      <a:extLst>
+                        <a:ext uri="{28A0092B-C50C-407E-A947-70E740481C1C}">
+                          <a14:useLocalDpi xmlns:a14="http://schemas.microsoft.com/office/drawing/2010/main" val="0"/>
+                        </a:ext>
+                      </a:extLst>
+                    </a:blip>
+                    <a:srcRect/>
+                    <a:stretch>
+                      <a:fillRect/>
+                    </a:stretch>
+                  </pic:blipFill>
+                  <pic:spPr bwMode="auto">
+                    <a:xfrm>
+                      <a:off x="0" y="0"/>
+                      <a:ext cx="5934075" cy="4200525"/>
+                    </a:xfrm>
+                    <a:prstGeom prst="rect">
+                      <a:avLst/>
+                    </a:prstGeom>
+                    <a:noFill/>
+                    <a:ln>
+                      <a:noFill/>
+                    </a:ln>
+                  </pic:spPr>
+                </pic:pic>
+              </a:graphicData>
+            </a:graphic>
+          </wp:inline>
+        </w:drawing>
+      </w:r>
+    </w:p>
+    <w:p>
+      <w:pPr>
+        <w:rPr>
+          <w:rFonts w:eastAsiaTheme="minorEastAsia"/>
+        </w:rPr>
+      </w:pPr>
     </w:p>
     <w:p>
       <w:pPr>
@@ -14841,13 +14872,7 @@
           <w:rPr>
             <w:rFonts w:ascii="Cambria Math" w:eastAsiaTheme="minorEastAsia" w:hAnsi="Cambria Math"/>
           </w:rPr>
-          <m:t>λ</m:t>
-        </m:r>
-        <m:r>
-          <w:rPr>
-            <w:rFonts w:ascii="Cambria Math" w:eastAsiaTheme="minorEastAsia" w:hAnsi="Cambria Math"/>
-          </w:rPr>
-          <m:t>≥0</m:t>
+          <m:t>λ≥0</m:t>
         </m:r>
       </m:oMath>
       <w:r>
@@ -14995,13 +15020,7 @@
             <w:rPr>
               <w:rFonts w:ascii="Cambria Math" w:eastAsia="Cambria Math" w:hAnsi="Cambria Math" w:cs="Cambria Math"/>
             </w:rPr>
-            <m:t>+λ</m:t>
-          </m:r>
-          <m:r>
-            <w:rPr>
-              <w:rFonts w:ascii="Cambria Math" w:eastAsia="Cambria Math" w:hAnsi="Cambria Math" w:cs="Cambria Math"/>
-            </w:rPr>
-            <m:t>∙</m:t>
+            <m:t>+λ∙</m:t>
           </m:r>
           <m:sSup>
             <m:sSupPr>
@@ -15582,13 +15601,7 @@
             <w:rPr>
               <w:rFonts w:ascii="Cambria Math" w:eastAsia="Cambria Math" w:hAnsi="Cambria Math"/>
             </w:rPr>
-            <m:t>=</m:t>
-          </m:r>
-          <m:r>
-            <w:rPr>
-              <w:rFonts w:ascii="Cambria Math" w:eastAsia="Cambria Math" w:hAnsi="Cambria Math"/>
-            </w:rPr>
-            <m:t>2</m:t>
+            <m:t>=2</m:t>
           </m:r>
           <m:d>
             <m:dPr>
@@ -16391,13 +16404,7 @@
             <w:rPr>
               <w:rFonts w:ascii="Cambria Math" w:eastAsia="Cambria Math" w:hAnsi="Cambria Math"/>
             </w:rPr>
-            <m:t>=</m:t>
-          </m:r>
-          <m:r>
-            <w:rPr>
-              <w:rFonts w:ascii="Cambria Math" w:eastAsia="Cambria Math" w:hAnsi="Cambria Math"/>
-            </w:rPr>
-            <m:t>2</m:t>
+            <m:t>=2</m:t>
           </m:r>
           <m:sSub>
             <m:sSubPr>
@@ -17163,13 +17170,7 @@
             <w:rPr>
               <w:rFonts w:ascii="Cambria Math" w:eastAsia="Cambria Math" w:hAnsi="Cambria Math"/>
             </w:rPr>
-            <m:t>=</m:t>
-          </m:r>
-          <m:r>
-            <w:rPr>
-              <w:rFonts w:ascii="Cambria Math" w:eastAsia="Cambria Math" w:hAnsi="Cambria Math"/>
-            </w:rPr>
-            <m:t>2</m:t>
+            <m:t>=2</m:t>
           </m:r>
           <m:sSub>
             <m:sSubPr>
@@ -18761,14 +18762,12 @@
         </w:rPr>
         <w:t>. Then by tak</w:t>
       </w:r>
-      <w:proofErr w:type="spellStart"/>
       <w:r>
         <w:rPr>
           <w:rFonts w:eastAsiaTheme="minorEastAsia"/>
         </w:rPr>
         <w:t>ing</w:t>
       </w:r>
-      <w:proofErr w:type="spellEnd"/>
       <w:r>
         <w:rPr>
           <w:rFonts w:eastAsiaTheme="minorEastAsia"/>

</xml_diff>

<commit_message>
Update Loss Function Derivative.docx
</commit_message>
<xml_diff>
--- a/DDM GD Find Alpha Rebuild/Loss Function Derivative.docx
+++ b/DDM GD Find Alpha Rebuild/Loss Function Derivative.docx
@@ -6839,11 +6839,19 @@
         </w:rPr>
         <w:t xml:space="preserve"> a</w:t>
       </w:r>
+      <w:proofErr w:type="spellStart"/>
       <w:r>
         <w:rPr>
           <w:rFonts w:eastAsiaTheme="minorEastAsia"/>
         </w:rPr>
-        <w:t>nd the variability itself</w:t>
+        <w:t>nd</w:t>
+      </w:r>
+      <w:proofErr w:type="spellEnd"/>
+      <w:r>
+        <w:rPr>
+          <w:rFonts w:eastAsiaTheme="minorEastAsia"/>
+        </w:rPr>
+        <w:t xml:space="preserve"> the variability itself</w:t>
       </w:r>
       <w:r>
         <w:rPr>
@@ -11558,56 +11566,6 @@
             </w:rPr>
             <m:t>≈</m:t>
           </m:r>
-          <m:sSup>
-            <m:sSupPr>
-              <m:ctrlPr>
-                <w:rPr>
-                  <w:rFonts w:ascii="Cambria Math" w:eastAsiaTheme="minorEastAsia" w:hAnsi="Cambria Math"/>
-                  <w:i/>
-                </w:rPr>
-              </m:ctrlPr>
-            </m:sSupPr>
-            <m:e>
-              <m:r>
-                <w:rPr>
-                  <w:rFonts w:ascii="Cambria Math" w:eastAsiaTheme="minorEastAsia" w:hAnsi="Cambria Math"/>
-                </w:rPr>
-                <m:t>s</m:t>
-              </m:r>
-              <m:d>
-                <m:dPr>
-                  <m:ctrlPr>
-                    <w:rPr>
-                      <w:rFonts w:ascii="Cambria Math" w:eastAsiaTheme="minorEastAsia" w:hAnsi="Cambria Math"/>
-                      <w:i/>
-                    </w:rPr>
-                  </m:ctrlPr>
-                </m:dPr>
-                <m:e>
-                  <m:r>
-                    <w:rPr>
-                      <w:rFonts w:ascii="Cambria Math" w:eastAsiaTheme="minorEastAsia" w:hAnsi="Cambria Math"/>
-                    </w:rPr>
-                    <m:t>α</m:t>
-                  </m:r>
-                </m:e>
-              </m:d>
-            </m:e>
-            <m:sup>
-              <m:r>
-                <w:rPr>
-                  <w:rFonts w:ascii="Cambria Math" w:eastAsiaTheme="minorEastAsia" w:hAnsi="Cambria Math"/>
-                </w:rPr>
-                <m:t>2</m:t>
-              </m:r>
-            </m:sup>
-          </m:sSup>
-          <m:r>
-            <w:rPr>
-              <w:rFonts w:ascii="Cambria Math" w:eastAsiaTheme="minorEastAsia" w:hAnsi="Cambria Math"/>
-            </w:rPr>
-            <m:t>=</m:t>
-          </m:r>
           <m:f>
             <m:fPr>
               <m:ctrlPr>
@@ -11770,6 +11728,81 @@
               </m:sSup>
             </m:e>
           </m:nary>
+          <m:r>
+            <w:rPr>
+              <w:rFonts w:ascii="Cambria Math" w:eastAsiaTheme="minorEastAsia" w:hAnsi="Cambria Math"/>
+            </w:rPr>
+            <m:t>=</m:t>
+          </m:r>
+          <m:f>
+            <m:fPr>
+              <m:ctrlPr>
+                <w:rPr>
+                  <w:rFonts w:ascii="Cambria Math" w:eastAsia="Cambria Math" w:hAnsi="Cambria Math"/>
+                </w:rPr>
+              </m:ctrlPr>
+            </m:fPr>
+            <m:num>
+              <m:r>
+                <w:rPr>
+                  <w:rFonts w:ascii="Cambria Math" w:eastAsia="Cambria Math" w:hAnsi="Cambria Math"/>
+                </w:rPr>
+                <m:t>n</m:t>
+              </m:r>
+            </m:num>
+            <m:den>
+              <m:r>
+                <w:rPr>
+                  <w:rFonts w:ascii="Cambria Math" w:eastAsia="Cambria Math" w:hAnsi="Cambria Math"/>
+                </w:rPr>
+                <m:t>n-1</m:t>
+              </m:r>
+            </m:den>
+          </m:f>
+          <m:sSup>
+            <m:sSupPr>
+              <m:ctrlPr>
+                <w:rPr>
+                  <w:rFonts w:ascii="Cambria Math" w:eastAsiaTheme="minorEastAsia" w:hAnsi="Cambria Math"/>
+                  <w:i/>
+                </w:rPr>
+              </m:ctrlPr>
+            </m:sSupPr>
+            <m:e>
+              <m:r>
+                <w:rPr>
+                  <w:rFonts w:ascii="Cambria Math" w:eastAsiaTheme="minorEastAsia" w:hAnsi="Cambria Math"/>
+                </w:rPr>
+                <m:t>s</m:t>
+              </m:r>
+              <m:d>
+                <m:dPr>
+                  <m:ctrlPr>
+                    <w:rPr>
+                      <w:rFonts w:ascii="Cambria Math" w:eastAsiaTheme="minorEastAsia" w:hAnsi="Cambria Math"/>
+                      <w:i/>
+                    </w:rPr>
+                  </m:ctrlPr>
+                </m:dPr>
+                <m:e>
+                  <m:r>
+                    <w:rPr>
+                      <w:rFonts w:ascii="Cambria Math" w:eastAsiaTheme="minorEastAsia" w:hAnsi="Cambria Math"/>
+                    </w:rPr>
+                    <m:t>α</m:t>
+                  </m:r>
+                </m:e>
+              </m:d>
+            </m:e>
+            <m:sup>
+              <m:r>
+                <w:rPr>
+                  <w:rFonts w:ascii="Cambria Math" w:eastAsiaTheme="minorEastAsia" w:hAnsi="Cambria Math"/>
+                </w:rPr>
+                <m:t>2</m:t>
+              </m:r>
+            </m:sup>
+          </m:sSup>
         </m:oMath>
       </m:oMathPara>
     </w:p>
@@ -14879,7 +14912,102 @@
         <w:rPr>
           <w:rFonts w:eastAsiaTheme="minorEastAsia"/>
         </w:rPr>
-        <w:t>, the loss function and its derivative is then:</w:t>
+        <w:t>,</w:t>
+      </w:r>
+      <w:r>
+        <w:rPr>
+          <w:rFonts w:eastAsiaTheme="minorEastAsia"/>
+        </w:rPr>
+        <w:t xml:space="preserve"> and including the unbiased estimator, (</w:t>
+      </w:r>
+      <m:oMath>
+        <m:f>
+          <m:fPr>
+            <m:ctrlPr>
+              <w:rPr>
+                <w:rFonts w:ascii="Cambria Math" w:eastAsia="Cambria Math" w:hAnsi="Cambria Math"/>
+              </w:rPr>
+            </m:ctrlPr>
+          </m:fPr>
+          <m:num>
+            <m:r>
+              <w:rPr>
+                <w:rFonts w:ascii="Cambria Math" w:eastAsia="Cambria Math" w:hAnsi="Cambria Math"/>
+              </w:rPr>
+              <m:t>n</m:t>
+            </m:r>
+          </m:num>
+          <m:den>
+            <m:r>
+              <w:rPr>
+                <w:rFonts w:ascii="Cambria Math" w:eastAsia="Cambria Math" w:hAnsi="Cambria Math"/>
+              </w:rPr>
+              <m:t>n-1</m:t>
+            </m:r>
+          </m:den>
+        </m:f>
+        <m:sSup>
+          <m:sSupPr>
+            <m:ctrlPr>
+              <w:rPr>
+                <w:rFonts w:ascii="Cambria Math" w:eastAsiaTheme="minorEastAsia" w:hAnsi="Cambria Math"/>
+                <w:i/>
+              </w:rPr>
+            </m:ctrlPr>
+          </m:sSupPr>
+          <m:e>
+            <m:r>
+              <w:rPr>
+                <w:rFonts w:ascii="Cambria Math" w:eastAsiaTheme="minorEastAsia" w:hAnsi="Cambria Math"/>
+              </w:rPr>
+              <m:t>s</m:t>
+            </m:r>
+            <m:d>
+              <m:dPr>
+                <m:ctrlPr>
+                  <w:rPr>
+                    <w:rFonts w:ascii="Cambria Math" w:eastAsiaTheme="minorEastAsia" w:hAnsi="Cambria Math"/>
+                    <w:i/>
+                  </w:rPr>
+                </m:ctrlPr>
+              </m:dPr>
+              <m:e>
+                <m:r>
+                  <w:rPr>
+                    <w:rFonts w:ascii="Cambria Math" w:eastAsiaTheme="minorEastAsia" w:hAnsi="Cambria Math"/>
+                  </w:rPr>
+                  <m:t>α</m:t>
+                </m:r>
+              </m:e>
+            </m:d>
+          </m:e>
+          <m:sup>
+            <m:r>
+              <w:rPr>
+                <w:rFonts w:ascii="Cambria Math" w:eastAsiaTheme="minorEastAsia" w:hAnsi="Cambria Math"/>
+              </w:rPr>
+              <m:t>2</m:t>
+            </m:r>
+          </m:sup>
+        </m:sSup>
+        <m:r>
+          <w:rPr>
+            <w:rFonts w:ascii="Cambria Math" w:eastAsiaTheme="minorEastAsia" w:hAnsi="Cambria Math"/>
+          </w:rPr>
+          <m:t>)</m:t>
+        </m:r>
+      </m:oMath>
+      <w:r>
+        <w:rPr>
+          <w:rFonts w:eastAsiaTheme="minorEastAsia"/>
+        </w:rPr>
+        <w:t>,</w:t>
+      </w:r>
+      <w:r>
+        <w:rPr>
+          <w:rFonts w:eastAsiaTheme="minorEastAsia"/>
+        </w:rPr>
+        <w:t xml:space="preserve"> the loss function and its derivative is then:</w:t>
       </w:r>
     </w:p>
     <w:p>
@@ -15022,6 +15150,31 @@
             </w:rPr>
             <m:t>+λ∙</m:t>
           </m:r>
+          <m:f>
+            <m:fPr>
+              <m:ctrlPr>
+                <w:rPr>
+                  <w:rFonts w:ascii="Cambria Math" w:eastAsia="Cambria Math" w:hAnsi="Cambria Math"/>
+                </w:rPr>
+              </m:ctrlPr>
+            </m:fPr>
+            <m:num>
+              <m:r>
+                <w:rPr>
+                  <w:rFonts w:ascii="Cambria Math" w:eastAsia="Cambria Math" w:hAnsi="Cambria Math"/>
+                </w:rPr>
+                <m:t>n</m:t>
+              </m:r>
+            </m:num>
+            <m:den>
+              <m:r>
+                <w:rPr>
+                  <w:rFonts w:ascii="Cambria Math" w:eastAsia="Cambria Math" w:hAnsi="Cambria Math"/>
+                </w:rPr>
+                <m:t>n-1</m:t>
+              </m:r>
+            </m:den>
+          </m:f>
           <m:sSup>
             <m:sSupPr>
               <m:ctrlPr>
@@ -15038,6 +15191,24 @@
                 </w:rPr>
                 <m:t>s</m:t>
               </m:r>
+              <m:d>
+                <m:dPr>
+                  <m:ctrlPr>
+                    <w:rPr>
+                      <w:rFonts w:ascii="Cambria Math" w:eastAsiaTheme="minorEastAsia" w:hAnsi="Cambria Math"/>
+                      <w:i/>
+                    </w:rPr>
+                  </m:ctrlPr>
+                </m:dPr>
+                <m:e>
+                  <m:r>
+                    <w:rPr>
+                      <w:rFonts w:ascii="Cambria Math" w:eastAsiaTheme="minorEastAsia" w:hAnsi="Cambria Math"/>
+                    </w:rPr>
+                    <m:t>α</m:t>
+                  </m:r>
+                </m:e>
+              </m:d>
             </m:e>
             <m:sup>
               <m:r>
@@ -15048,24 +15219,6 @@
               </m:r>
             </m:sup>
           </m:sSup>
-          <m:d>
-            <m:dPr>
-              <m:ctrlPr>
-                <w:rPr>
-                  <w:rFonts w:ascii="Cambria Math" w:eastAsiaTheme="minorEastAsia" w:hAnsi="Cambria Math"/>
-                  <w:i/>
-                </w:rPr>
-              </m:ctrlPr>
-            </m:dPr>
-            <m:e>
-              <m:r>
-                <w:rPr>
-                  <w:rFonts w:ascii="Cambria Math" w:eastAsiaTheme="minorEastAsia" w:hAnsi="Cambria Math"/>
-                </w:rPr>
-                <m:t>α</m:t>
-              </m:r>
-            </m:e>
-          </m:d>
         </m:oMath>
       </m:oMathPara>
     </w:p>
@@ -15290,16 +15443,47 @@
                 <w:rPr>
                   <w:rFonts w:ascii="Cambria Math" w:eastAsia="Cambria Math" w:hAnsi="Cambria Math" w:cs="Cambria Math"/>
                 </w:rPr>
-                <m:t>λ-1</m:t>
+                <m:t>λ∙</m:t>
+              </m:r>
+              <m:f>
+                <m:fPr>
+                  <m:ctrlPr>
+                    <w:rPr>
+                      <w:rFonts w:ascii="Cambria Math" w:eastAsia="Cambria Math" w:hAnsi="Cambria Math"/>
+                    </w:rPr>
+                  </m:ctrlPr>
+                </m:fPr>
+                <m:num>
+                  <m:r>
+                    <w:rPr>
+                      <w:rFonts w:ascii="Cambria Math" w:eastAsia="Cambria Math" w:hAnsi="Cambria Math"/>
+                    </w:rPr>
+                    <m:t>n</m:t>
+                  </m:r>
+                </m:num>
+                <m:den>
+                  <m:r>
+                    <w:rPr>
+                      <w:rFonts w:ascii="Cambria Math" w:eastAsia="Cambria Math" w:hAnsi="Cambria Math"/>
+                    </w:rPr>
+                    <m:t>n-1</m:t>
+                  </m:r>
+                </m:den>
+              </m:f>
+              <m:r>
+                <w:rPr>
+                  <w:rFonts w:ascii="Cambria Math" w:eastAsia="Cambria Math" w:hAnsi="Cambria Math" w:cs="Cambria Math"/>
+                </w:rPr>
+                <m:t>-</m:t>
+              </m:r>
+              <m:r>
+                <w:rPr>
+                  <w:rFonts w:ascii="Cambria Math" w:eastAsia="Cambria Math" w:hAnsi="Cambria Math" w:cs="Cambria Math"/>
+                </w:rPr>
+                <m:t>1</m:t>
               </m:r>
             </m:e>
           </m:d>
-          <m:r>
-            <w:rPr>
-              <w:rFonts w:ascii="Cambria Math" w:eastAsiaTheme="minorEastAsia" w:hAnsi="Cambria Math"/>
-            </w:rPr>
-            <m:t>∙</m:t>
-          </m:r>
           <m:sSup>
             <m:sSupPr>
               <m:ctrlPr>
@@ -15732,8 +15916,33 @@
             <w:rPr>
               <w:rFonts w:ascii="Cambria Math" w:eastAsia="Cambria Math" w:hAnsi="Cambria Math" w:cs="Cambria Math"/>
             </w:rPr>
-            <m:t>λ</m:t>
+            <m:t>λ∙</m:t>
           </m:r>
+          <m:f>
+            <m:fPr>
+              <m:ctrlPr>
+                <w:rPr>
+                  <w:rFonts w:ascii="Cambria Math" w:eastAsia="Cambria Math" w:hAnsi="Cambria Math"/>
+                </w:rPr>
+              </m:ctrlPr>
+            </m:fPr>
+            <m:num>
+              <m:r>
+                <w:rPr>
+                  <w:rFonts w:ascii="Cambria Math" w:eastAsia="Cambria Math" w:hAnsi="Cambria Math"/>
+                </w:rPr>
+                <m:t>n</m:t>
+              </m:r>
+            </m:num>
+            <m:den>
+              <m:r>
+                <w:rPr>
+                  <w:rFonts w:ascii="Cambria Math" w:eastAsia="Cambria Math" w:hAnsi="Cambria Math"/>
+                </w:rPr>
+                <m:t>n-1</m:t>
+              </m:r>
+            </m:den>
+          </m:f>
           <m:f>
             <m:fPr>
               <m:ctrlPr>
@@ -16109,8 +16318,33 @@
             <w:rPr>
               <w:rFonts w:ascii="Cambria Math" w:eastAsia="Cambria Math" w:hAnsi="Cambria Math" w:cs="Cambria Math"/>
             </w:rPr>
-            <m:t>λ</m:t>
+            <m:t>λ∙</m:t>
           </m:r>
+          <m:f>
+            <m:fPr>
+              <m:ctrlPr>
+                <w:rPr>
+                  <w:rFonts w:ascii="Cambria Math" w:eastAsia="Cambria Math" w:hAnsi="Cambria Math"/>
+                </w:rPr>
+              </m:ctrlPr>
+            </m:fPr>
+            <m:num>
+              <m:r>
+                <w:rPr>
+                  <w:rFonts w:ascii="Cambria Math" w:eastAsia="Cambria Math" w:hAnsi="Cambria Math"/>
+                </w:rPr>
+                <m:t>n</m:t>
+              </m:r>
+            </m:num>
+            <m:den>
+              <m:r>
+                <w:rPr>
+                  <w:rFonts w:ascii="Cambria Math" w:eastAsia="Cambria Math" w:hAnsi="Cambria Math"/>
+                </w:rPr>
+                <m:t>n-1</m:t>
+              </m:r>
+            </m:den>
+          </m:f>
           <m:f>
             <m:fPr>
               <m:ctrlPr>
@@ -16384,8 +16618,33 @@
             <w:rPr>
               <w:rFonts w:ascii="Cambria Math" w:eastAsia="Cambria Math" w:hAnsi="Cambria Math" w:cs="Cambria Math"/>
             </w:rPr>
-            <m:t>λ</m:t>
+            <m:t>λ∙</m:t>
           </m:r>
+          <m:f>
+            <m:fPr>
+              <m:ctrlPr>
+                <w:rPr>
+                  <w:rFonts w:ascii="Cambria Math" w:eastAsia="Cambria Math" w:hAnsi="Cambria Math"/>
+                </w:rPr>
+              </m:ctrlPr>
+            </m:fPr>
+            <m:num>
+              <m:r>
+                <w:rPr>
+                  <w:rFonts w:ascii="Cambria Math" w:eastAsia="Cambria Math" w:hAnsi="Cambria Math"/>
+                </w:rPr>
+                <m:t>n</m:t>
+              </m:r>
+            </m:num>
+            <m:den>
+              <m:r>
+                <w:rPr>
+                  <w:rFonts w:ascii="Cambria Math" w:eastAsia="Cambria Math" w:hAnsi="Cambria Math"/>
+                </w:rPr>
+                <m:t>n-1</m:t>
+              </m:r>
+            </m:den>
+          </m:f>
           <m:f>
             <m:fPr>
               <m:ctrlPr>
@@ -16908,8 +17167,39 @@
             <w:rPr>
               <w:rFonts w:ascii="Cambria Math" w:eastAsiaTheme="minorEastAsia" w:hAnsi="Cambria Math"/>
             </w:rPr>
-            <m:t>+λ</m:t>
+            <m:t>+</m:t>
           </m:r>
+          <m:r>
+            <w:rPr>
+              <w:rFonts w:ascii="Cambria Math" w:eastAsia="Cambria Math" w:hAnsi="Cambria Math" w:cs="Cambria Math"/>
+            </w:rPr>
+            <m:t>λ∙</m:t>
+          </m:r>
+          <m:f>
+            <m:fPr>
+              <m:ctrlPr>
+                <w:rPr>
+                  <w:rFonts w:ascii="Cambria Math" w:eastAsia="Cambria Math" w:hAnsi="Cambria Math"/>
+                </w:rPr>
+              </m:ctrlPr>
+            </m:fPr>
+            <m:num>
+              <m:r>
+                <w:rPr>
+                  <w:rFonts w:ascii="Cambria Math" w:eastAsia="Cambria Math" w:hAnsi="Cambria Math"/>
+                </w:rPr>
+                <m:t>n</m:t>
+              </m:r>
+            </m:num>
+            <m:den>
+              <m:r>
+                <w:rPr>
+                  <w:rFonts w:ascii="Cambria Math" w:eastAsia="Cambria Math" w:hAnsi="Cambria Math"/>
+                </w:rPr>
+                <m:t>n-1</m:t>
+              </m:r>
+            </m:den>
+          </m:f>
           <m:f>
             <m:fPr>
               <m:ctrlPr>
@@ -17028,13 +17318,7 @@
             <w:rPr>
               <w:rFonts w:ascii="Cambria Math" w:eastAsiaTheme="minorEastAsia" w:hAnsi="Cambria Math"/>
             </w:rPr>
-            <m:t>+</m:t>
-          </m:r>
-          <m:r>
-            <w:rPr>
-              <w:rFonts w:ascii="Cambria Math" w:eastAsiaTheme="minorEastAsia" w:hAnsi="Cambria Math"/>
-            </w:rPr>
-            <m:t>2</m:t>
+            <m:t>+2</m:t>
           </m:r>
           <m:d>
             <m:dPr>
@@ -17200,13 +17484,7 @@
             <w:rPr>
               <w:rFonts w:ascii="Cambria Math" w:eastAsiaTheme="minorEastAsia" w:hAnsi="Cambria Math"/>
             </w:rPr>
-            <m:t>+</m:t>
-          </m:r>
-          <m:r>
-            <w:rPr>
-              <w:rFonts w:ascii="Cambria Math" w:eastAsiaTheme="minorEastAsia" w:hAnsi="Cambria Math"/>
-            </w:rPr>
-            <m:t>2</m:t>
+            <m:t>+2</m:t>
           </m:r>
           <m:d>
             <m:dPr>
@@ -17574,8 +17852,39 @@
                 <w:rPr>
                   <w:rFonts w:ascii="Cambria Math" w:eastAsiaTheme="minorEastAsia" w:hAnsi="Cambria Math"/>
                 </w:rPr>
-                <m:t>+λ</m:t>
-              </m:r>
+                <m:t>+</m:t>
+              </m:r>
+              <m:r>
+                <w:rPr>
+                  <w:rFonts w:ascii="Cambria Math" w:eastAsia="Cambria Math" w:hAnsi="Cambria Math" w:cs="Cambria Math"/>
+                </w:rPr>
+                <m:t>λ∙</m:t>
+              </m:r>
+              <m:f>
+                <m:fPr>
+                  <m:ctrlPr>
+                    <w:rPr>
+                      <w:rFonts w:ascii="Cambria Math" w:eastAsia="Cambria Math" w:hAnsi="Cambria Math"/>
+                    </w:rPr>
+                  </m:ctrlPr>
+                </m:fPr>
+                <m:num>
+                  <m:r>
+                    <w:rPr>
+                      <w:rFonts w:ascii="Cambria Math" w:eastAsia="Cambria Math" w:hAnsi="Cambria Math"/>
+                    </w:rPr>
+                    <m:t>n</m:t>
+                  </m:r>
+                </m:num>
+                <m:den>
+                  <m:r>
+                    <w:rPr>
+                      <w:rFonts w:ascii="Cambria Math" w:eastAsia="Cambria Math" w:hAnsi="Cambria Math"/>
+                    </w:rPr>
+                    <m:t>n-1</m:t>
+                  </m:r>
+                </m:den>
+              </m:f>
               <m:f>
                 <m:fPr>
                   <m:ctrlPr>
@@ -18103,13 +18412,7 @@
                     <w:rPr>
                       <w:rFonts w:ascii="Cambria Math" w:eastAsiaTheme="minorEastAsia" w:hAnsi="Cambria Math"/>
                     </w:rPr>
-                    <m:t>-</m:t>
-                  </m:r>
-                  <m:r>
-                    <w:rPr>
-                      <w:rFonts w:ascii="Cambria Math" w:eastAsiaTheme="minorEastAsia" w:hAnsi="Cambria Math"/>
-                    </w:rPr>
-                    <m:t>1</m:t>
+                    <m:t>-1</m:t>
                   </m:r>
                 </m:e>
               </m:d>
@@ -19041,12 +19344,14 @@
         </w:rPr>
         <w:t>. Then by tak</w:t>
       </w:r>
+      <w:proofErr w:type="spellStart"/>
       <w:r>
         <w:rPr>
           <w:rFonts w:eastAsiaTheme="minorEastAsia"/>
         </w:rPr>
         <w:t>ing</w:t>
       </w:r>
+      <w:proofErr w:type="spellEnd"/>
       <w:r>
         <w:rPr>
           <w:rFonts w:eastAsiaTheme="minorEastAsia"/>

</xml_diff>